<commit_message>
[Attended] Build 270: Skip SGML tags resolved — round 2
Resolved:
1. Credits: Boss first, GPT-5.3 training cutoff August 2025
2. Evaluate Care image border: preserved (not changed)
3. Moat diagram v4: Naples yellow center, Courier red text,
   incremental lighter hues per ring, ovals circling target
   with curved connector lines, grey borders

DC-11/12/13 still missing from feature list — next pass.

Co-Authored-By: Claude Opus 4.6 (1M context) <noreply@anthropic.com>
</commit_message>
<xml_diff>
--- a/brain/BusinessArtifacts/ChatHealthyOperationalBusinessArchitecture.docx
+++ b/brain/BusinessArtifacts/ChatHealthyOperationalBusinessArchitecture.docx
@@ -114,7 +114,7 @@
         <w:rPr>
           <w:sz w:val="18"/>
         </w:rPr>
-        <w:t xml:space="preserve">With assistance from </w:t>
+        <w:t xml:space="preserve">Assistance from </w:t>
       </w:r>
       <w:r>
         <w:rPr>
@@ -127,7 +127,7 @@
         <w:rPr>
           <w:sz w:val="18"/>
         </w:rPr>
-        <w:t xml:space="preserve"> (OpenAI, Enterprise Architect)</w:t>
+        <w:t xml:space="preserve"> (OpenAI, training cutoff August 2025)</w:t>
       </w:r>
     </w:p>
     <w:p>
@@ -957,7 +957,7 @@
       <w:r>
         <w:drawing>
           <wp:inline xmlns:a="http://schemas.openxmlformats.org/drawingml/2006/main" xmlns:pic="http://schemas.openxmlformats.org/drawingml/2006/picture">
-            <wp:extent cx="4114800" cy="2947481"/>
+            <wp:extent cx="4114800" cy="3539840"/>
             <wp:docPr id="7" name="Picture 7"/>
             <wp:cNvGraphicFramePr>
               <a:graphicFrameLocks noChangeAspect="1"/>
@@ -978,7 +978,7 @@
                   <pic:spPr>
                     <a:xfrm>
                       <a:off x="0" y="0"/>
-                      <a:ext cx="4114800" cy="2947481"/>
+                      <a:ext cx="4114800" cy="3539840"/>
                     </a:xfrm>
                     <a:prstGeom prst="rect"/>
                   </pic:spPr>

</xml_diff>

<commit_message>
[Attended] Build 326: Consolidate business docs — 3 artifacts to 2
Deleted biz_arch_investor.pdf (v1 superseded by v2).
Updated ChatHealthyOperationalBusinessArchitecture.docx with The Brain section.
Two artifacts remain: funding pitch (v2 PDF) and operational biz arch (.docx).
Updated business_plan.json description to reflect 4-component architecture.

Co-Authored-By: Claude Opus 4.6 (1M context) <noreply@anthropic.com>
</commit_message>
<xml_diff>
--- a/brain/BusinessArtifacts/ChatHealthyOperationalBusinessArchitecture.docx
+++ b/brain/BusinessArtifacts/ChatHealthyOperationalBusinessArchitecture.docx
@@ -51,7 +51,7 @@
           <w:color w:val="646464"/>
           <w:sz w:val="20"/>
         </w:rPr>
-        <w:t>March 31, 2026  |  Build 269</w:t>
+        <w:t>April 1, 2026  |  Build 325</w:t>
       </w:r>
     </w:p>
     <w:p/>
@@ -246,7 +246,7 @@
     </w:p>
     <w:p>
       <w:r>
-        <w:t>ChatHealthy.ai is built on three business components. The consumer is at the center, orchestrating the relationship between all three. This is not a sequential journey -- it is a decision-making environment.</w:t>
+        <w:t>ChatHealthy.ai is built on four business components — three product components and one DevOps component. The consumer is at the center, orchestrating the relationship between all three. This is not a sequential journey -- it is a decision-making environment.</w:t>
       </w:r>
     </w:p>
     <w:p>
@@ -808,6 +808,195 @@
           <w:b/>
         </w:rPr>
         <w:t>Pricing: Premium via AI token usage markup; users pay only when they choose advanced AI participation</w:t>
+      </w:r>
+    </w:p>
+    <w:p>
+      <w:r>
+        <w:rPr>
+          <w:sz w:val="12"/>
+        </w:rPr>
+      </w:r>
+    </w:p>
+    <w:p>
+      <w:r>
+        <w:rPr>
+          <w:b/>
+          <w:color w:val="000000"/>
+          <w:sz w:val="32"/>
+        </w:rPr>
+        <w:t>The Brain</w:t>
+      </w:r>
+    </w:p>
+    <w:p>
+      <w:r>
+        <w:rPr>
+          <w:b/>
+          <w:color w:val="505050"/>
+          <w:sz w:val="22"/>
+        </w:rPr>
+        <w:t>Build it right. Build it governed.</w:t>
+      </w:r>
+    </w:p>
+    <w:p>
+      <w:r/>
+    </w:p>
+    <w:p>
+      <w:r>
+        <w:rPr>
+          <w:sz w:val="20"/>
+        </w:rPr>
+        <w:t>The Brain is the fourth business component of ChatHealthy.ai and the first of its kind: an end-to-end automated but attended native AI SDLC with gateways and governance. It is the system that builds the system — governing how the product is planned, built, tested, and released.</w:t>
+      </w:r>
+    </w:p>
+    <w:p>
+      <w:r/>
+    </w:p>
+    <w:p>
+      <w:r>
+        <w:rPr>
+          <w:sz w:val="20"/>
+        </w:rPr>
+        <w:t>Unlike the three product components (Find Care, Evaluate Care, Discuss Care), The Brain is a DevOps component. It is public but not customer-facing. It exists because ChatHealthy.ai is built by a one-person team operating with two AI agents at enterprise discipline — without enterprise headcount.</w:t>
+      </w:r>
+    </w:p>
+    <w:p>
+      <w:r/>
+    </w:p>
+    <w:p>
+      <w:r>
+        <w:rPr>
+          <w:b/>
+          <w:sz w:val="24"/>
+        </w:rPr>
+        <w:t>How It Works</w:t>
+      </w:r>
+    </w:p>
+    <w:p>
+      <w:r>
+        <w:rPr>
+          <w:sz w:val="20"/>
+        </w:rPr>
+        <w:t>The founder (Boss) directs. GPT (Enterprise Architect, gpt-5.3) plans epics, features, stories, and boolean requirements. Claude (Engineer, claude-opus-4-6) executes code, tests, and deploys. Every phase of the SDLC is automated but attended — Boss holds all gate authority. No code ships without structured QA and governance sign-off.</w:t>
+      </w:r>
+    </w:p>
+    <w:p>
+      <w:r/>
+    </w:p>
+    <w:p>
+      <w:r>
+        <w:rPr>
+          <w:b/>
+          <w:sz w:val="24"/>
+        </w:rPr>
+        <w:t>Operational Today</w:t>
+      </w:r>
+    </w:p>
+    <w:p>
+      <w:r>
+        <w:rPr>
+          <w:sz w:val="20"/>
+        </w:rPr>
+        <w:t xml:space="preserve">  •  Corporate governance policies (GOV-001 through GOV-009) — enforced on every AI operation</w:t>
+      </w:r>
+    </w:p>
+    <w:p>
+      <w:r>
+        <w:rPr>
+          <w:sz w:val="20"/>
+        </w:rPr>
+        <w:t xml:space="preserve">  •  Structured assignment queue — GPT and Claude receive work as schema-validated JSON</w:t>
+      </w:r>
+    </w:p>
+    <w:p>
+      <w:r>
+        <w:rPr>
+          <w:sz w:val="20"/>
+        </w:rPr>
+        <w:t xml:space="preserve">  •  GPTReader service — authenticated, audited, read-only API for GPT to access Brain data (27/27 SIT pass)</w:t>
+      </w:r>
+    </w:p>
+    <w:p>
+      <w:r>
+        <w:rPr>
+          <w:sz w:val="20"/>
+        </w:rPr>
+        <w:t xml:space="preserve">  •  Project manifest — every code file catalogued with capabilities</w:t>
+      </w:r>
+    </w:p>
+    <w:p>
+      <w:r>
+        <w:rPr>
+          <w:sz w:val="20"/>
+        </w:rPr>
+        <w:t xml:space="preserve">  •  Audit trail — SIT reports, QA reports, UAT sign-offs, execution logs</w:t>
+      </w:r>
+    </w:p>
+    <w:p>
+      <w:r>
+        <w:rPr>
+          <w:sz w:val="20"/>
+        </w:rPr>
+        <w:t xml:space="preserve">  •  Business artifacts gate — no production release without QA report, IP agreement, and business model</w:t>
+      </w:r>
+    </w:p>
+    <w:p>
+      <w:r/>
+    </w:p>
+    <w:p>
+      <w:r>
+        <w:rPr>
+          <w:b/>
+          <w:sz w:val="24"/>
+        </w:rPr>
+        <w:t>Planned (v0.1.4)</w:t>
+      </w:r>
+    </w:p>
+    <w:p>
+      <w:r>
+        <w:rPr>
+          <w:sz w:val="20"/>
+        </w:rPr>
+        <w:t xml:space="preserve">  •  Centralized prompt management — all AI agent prompts cached, versioned, loaded from Brain at runtime</w:t>
+      </w:r>
+    </w:p>
+    <w:p>
+      <w:r>
+        <w:rPr>
+          <w:sz w:val="20"/>
+        </w:rPr>
+        <w:t xml:space="preserve">  •  Epic planning with boolean testable requirements per story</w:t>
+      </w:r>
+    </w:p>
+    <w:p>
+      <w:r/>
+    </w:p>
+    <w:p>
+      <w:r>
+        <w:rPr>
+          <w:b/>
+          <w:sz w:val="24"/>
+        </w:rPr>
+        <w:t>Why It Matters to Investors</w:t>
+      </w:r>
+    </w:p>
+    <w:p>
+      <w:r>
+        <w:rPr>
+          <w:sz w:val="20"/>
+        </w:rPr>
+        <w:t>The Brain demonstrates that AI-native software delivery at enterprise governance standards is achievable with a team of one human and two AI agents. This is not a prototype — it produced the v0.1.3 production release with formal QA, SIT, UAT, and release gate approval. The Brain is itself IP: a replicable model for AI-first software delivery that could be extracted into a standalone product.</w:t>
+      </w:r>
+    </w:p>
+    <w:p>
+      <w:r/>
+    </w:p>
+    <w:p>
+      <w:r>
+        <w:rPr>
+          <w:b/>
+          <w:sz w:val="20"/>
+        </w:rPr>
+        <w:t>Pricing: not applicable (DevOps infrastructure, not a revenue component)</w:t>
       </w:r>
     </w:p>
     <w:p>

</xml_diff>